<commit_message>
Replace memo with canonical markdown source
Pandoc-reconstructed version (commit 8eed71f) was a placeholder produced
from the docx. This commit installs the canonical hand-written markdown
source. Precision fix from Task 2 (t=3/t=4 generic phrasing) is preserved.

Co-Authored-By: Claude Opus 4.7 <noreply@anthropic.com>
</commit_message>
<xml_diff>
--- a/deliverables/project_results_memo.docx
+++ b/deliverables/project_results_memo.docx
@@ -2,7 +2,7 @@
 <file path=word/document.xml><?xml version="1.0" encoding="utf-8"?>
 <w:document xmlns:w="http://schemas.openxmlformats.org/wordprocessingml/2006/main" xmlns:m="http://schemas.openxmlformats.org/officeDocument/2006/math" xmlns:r="http://schemas.openxmlformats.org/officeDocument/2006/relationships" xmlns:o="urn:schemas-microsoft-com:office:office" xmlns:v="urn:schemas-microsoft-com:vml" xmlns:w10="urn:schemas-microsoft-com:office:word" xmlns:a="http://schemas.openxmlformats.org/drawingml/2006/main" xmlns:pic="http://schemas.openxmlformats.org/drawingml/2006/picture" xmlns:wp="http://schemas.openxmlformats.org/drawingml/2006/wordprocessingDrawing">
   <w:body>
-    <w:bookmarkStart w:id="25" w:name="Xcfacc4cd7ad36c242fe059e7484d27cc6f8f603"/>
+    <w:bookmarkStart w:id="26" w:name="Xcfacc4cd7ad36c242fe059e7484d27cc6f8f603"/>
     <w:p>
       <w:pPr>
         <w:pStyle w:val="Heading1"/>
@@ -14,13 +14,59 @@
     <w:p>
       <w:pPr>
         <w:pStyle w:val="FirstParagraph"/>
+      </w:pPr>
+      <w:r>
+        <w:rPr>
+          <w:b/>
+          <w:bCs/>
+        </w:rPr>
+        <w:t xml:space="preserve">A firm-level analysis of the policy mechanism identified by Bloomfield, Goodman, Rao &amp; Slavov</w:t>
+      </w:r>
+    </w:p>
+    <w:p>
+      <w:pPr>
+        <w:pStyle w:val="BodyText"/>
       </w:pPr>
       <w:r>
         <w:rPr>
           <w:i/>
           <w:iCs/>
         </w:rPr>
-        <w:t xml:space="preserve">A firm-level analysis of the policy mechanism identified by Bloomfield, Goodman, Rao &amp; Slavov</w:t>
+        <w:t xml:space="preserve">America First Policy Institute</w:t>
+      </w:r>
+      <w:r>
+        <w:t xml:space="preserve"> </w:t>
+      </w:r>
+      <w:r>
+        <w:rPr>
+          <w:i/>
+          <w:iCs/>
+        </w:rPr>
+        <w:t xml:space="preserve">May 2026</w:t>
+      </w:r>
+    </w:p>
+    <w:p>
+      <w:r>
+        <w:pict>
+          <v:rect style="width:0;height:1.5pt" o:hralign="center" o:hrstd="t" o:hr="t"/>
+        </w:pict>
+      </w:r>
+    </w:p>
+    <w:bookmarkStart w:id="9" w:name="executive-summary"/>
+    <w:p>
+      <w:pPr>
+        <w:pStyle w:val="Heading2"/>
+      </w:pPr>
+      <w:r>
+        <w:t xml:space="preserve">Executive Summary</w:t>
+      </w:r>
+    </w:p>
+    <w:p>
+      <w:pPr>
+        <w:pStyle w:val="FirstParagraph"/>
+      </w:pPr>
+      <w:r>
+        <w:t xml:space="preserve">State auto-IRA mandates cause meaningful private 401(k) plan formation among small employers. Using federal Form 5500 filings across the ten states with active auto-IRA mandates, this analysis identifies approximately 106,577 firms that established new 401(k) plans after their state's mandate took effect. A staggered difference-in-differences design comparing mandate states to non-mandate controls produces an average treatment effect of approximately 2.37 additional new 401(k) plans per 1,000 private establishments per year. The result is robust to dropping California (which accounts for the largest share of the dataset), to dropping the most recently mandated states, and to alternative denominator definitions including the policy-relevant subset of mandate-eligible firms (~7.83 per 1,000 SUSB-defined firms with five or more employees).</w:t>
       </w:r>
     </w:p>
     <w:p>
@@ -28,7 +74,7 @@
         <w:pStyle w:val="BodyText"/>
       </w:pPr>
       <w:r>
-        <w:t xml:space="preserve">America First Policy Institute</w:t>
+        <w:t xml:space="preserve">The finding extends Bloomfield, Goodman, Rao and Slavov's NBER work on the firm-side "crowd-in" response to state mandates by providing firm-level identification, a difference-in-differences research design, and external corroboration from independent provider data. A separate analysis by Gusto using its own 300,000-firm small-business administrative dataset estimates a 45 percent increase in 401(k) adoption among Colorado firms subject to the SecureSavings mandate, with the largest gains in the same 5–9 employee firm-size band that this analysis identifies as the dominant source of new plan formation. The Colorado Department of Treasury officially cites this finding in its 2024 program announcement.</w:t>
       </w:r>
     </w:p>
     <w:p>
@@ -36,24 +82,7 @@
         <w:pStyle w:val="BodyText"/>
       </w:pPr>
       <w:r>
-        <w:t xml:space="preserve">May 2026</w:t>
-      </w:r>
-    </w:p>
-    <w:bookmarkStart w:id="9" w:name="executive-summary"/>
-    <w:p>
-      <w:pPr>
-        <w:pStyle w:val="Heading2"/>
-      </w:pPr>
-      <w:r>
-        <w:t xml:space="preserve">Executive Summary</w:t>
-      </w:r>
-    </w:p>
-    <w:p>
-      <w:pPr>
-        <w:pStyle w:val="FirstParagraph"/>
-      </w:pPr>
-      <w:r>
-        <w:t xml:space="preserve">State auto-IRA mandates cause meaningful private 401(k) plan formation among small employers. Using federal Form 5500 filings across the ten states with active auto-IRA mandates, this analysis identifies approximately 106,577 firms that established new 401(k) plans after their state's mandate took effect. A staggered difference-in-differences design comparing mandate states to non-mandate controls produces an average treatment effect of approximately 2.37 additional new 401(k) plans per 1,000 private establishments per year. The result is robust to dropping California (which accounts for the largest share of the dataset), to dropping the most recently mandated states, and to alternative denominator definitions including the policy-relevant subset of mandate-eligible firms (~7.83 per 1,000 SUSB-defined firms with five or more employees).</w:t>
+        <w:t xml:space="preserve">The mandate-induced response is concentrated in small employers. Sixty-two percent of mandate-induced plans are established by firms with nine or fewer participants. The headline finding is therefore best understood as: state auto-IRA mandates cause small private employers, who would otherwise have no retirement plan, to establish private 401(k) plans rather than enroll in the state-facilitated alternative.</w:t>
       </w:r>
     </w:p>
     <w:p>
@@ -61,23 +90,14 @@
         <w:pStyle w:val="BodyText"/>
       </w:pPr>
       <w:r>
-        <w:t xml:space="preserve">The finding extends Bloomfield, Goodman, Rao and Slavov's NBER work on the firm-side "crowd-in" response to state mandates by providing firm-level identification, a difference-in-differences research design, and external corroboration from independent provider data. A separate analysis by Gusto using its own 300,000-firm small-business administrative dataset estimates a 45 percent increase in 401(k) adoption among Colorado firms subject to the SecureSavings mandate, with the largest gains in the same 5–9 employee firm-size band that this analysis identifies as the dominant source of new plan formation. The Colorado Department of Treasury officially cites this finding in its 2024 program announcement.</w:t>
-      </w:r>
-    </w:p>
-    <w:p>
-      <w:pPr>
-        <w:pStyle w:val="BodyText"/>
-      </w:pPr>
-      <w:r>
-        <w:t xml:space="preserve">The mandate-induced response is concentrated in small employers. Sixty-two percent of mandate-induced plans are established by firms with nine or fewer participants. The headline finding is therefore best understood as: state auto-IRA mandates cause small private employers, who would otherwise have no retirement plan, to establish private 401(k) plans rather than enroll in the state-facilitated alternative.</w:t>
-      </w:r>
-    </w:p>
-    <w:p>
-      <w:pPr>
-        <w:pStyle w:val="BodyText"/>
-      </w:pPr>
-      <w:r>
         <w:t xml:space="preserve">This memo summarizes the dataset construction, identification strategy, headline findings, robustness program, and the analytical limits of the design.</w:t>
+      </w:r>
+    </w:p>
+    <w:p>
+      <w:r>
+        <w:pict>
+          <v:rect style="width:0;height:1.5pt" o:hralign="center" o:hrstd="t" o:hr="t"/>
+        </w:pict>
       </w:r>
     </w:p>
     <w:bookmarkEnd w:id="9"/>
@@ -103,7 +123,39 @@
         <w:pStyle w:val="BodyText"/>
       </w:pPr>
       <w:r>
-        <w:t xml:space="preserve">The retirement-policy literature has historically debated whether state mandates would crowd out private plan formation (by creating a lower-administrative-burden alternative) or crowd in private plan formation (by raising the policy salience of retirement coverage and creating a forcing event for compliance decisions). Bloomfield, Goodman, Rao and Slavov (NBER) found evidence of crowd-in: roughly 17 percent of mandate-affected firms in their data established employer-sponsored retirement plans after the mandate took effect, with no corresponding crowd-out.</w:t>
+        <w:t xml:space="preserve">The retirement-policy literature has historically debated whether state mandates would</w:t>
+      </w:r>
+      <w:r>
+        <w:t xml:space="preserve"> </w:t>
+      </w:r>
+      <w:r>
+        <w:rPr>
+          <w:i/>
+          <w:iCs/>
+        </w:rPr>
+        <w:t xml:space="preserve">crowd out</w:t>
+      </w:r>
+      <w:r>
+        <w:t xml:space="preserve"> </w:t>
+      </w:r>
+      <w:r>
+        <w:t xml:space="preserve">private plan formation (by creating a lower-administrative-burden alternative) or</w:t>
+      </w:r>
+      <w:r>
+        <w:t xml:space="preserve"> </w:t>
+      </w:r>
+      <w:r>
+        <w:rPr>
+          <w:i/>
+          <w:iCs/>
+        </w:rPr>
+        <w:t xml:space="preserve">crowd in</w:t>
+      </w:r>
+      <w:r>
+        <w:t xml:space="preserve"> </w:t>
+      </w:r>
+      <w:r>
+        <w:t xml:space="preserve">private plan formation (by raising the policy salience of retirement coverage and creating a forcing event for compliance decisions). Bloomfield, Goodman, Rao and Slavov (NBER) found evidence of crowd-in: roughly 17 percent of mandate-affected firms in their data established employer-sponsored retirement plans after the mandate took effect, with no corresponding crowd-out.</w:t>
       </w:r>
     </w:p>
     <w:p>
@@ -112,6 +164,13 @@
       </w:pPr>
       <w:r>
         <w:t xml:space="preserve">This analysis investigates the firm-side response identified by Bloomfield, Goodman, Rao and Slavov using a different research design and a more recent dataset. The contribution is threefold: (1) firm-level identification using federal Form 5500 filings rather than the aggregate state-level data their paper relies on; (2) a Callaway-Sant'Anna staggered difference-in-differences estimator applied to ten mandate states with non-mandate states as controls; and (3) firm-level descriptive analysis of which firms respond to mandates.</w:t>
+      </w:r>
+    </w:p>
+    <w:p>
+      <w:r>
+        <w:pict>
+          <v:rect style="width:0;height:1.5pt" o:hralign="center" o:hrstd="t" o:hr="t"/>
+        </w:pict>
       </w:r>
     </w:p>
     <w:bookmarkEnd w:id="10"/>
@@ -171,7 +230,6 @@
           <w:p>
             <w:pPr>
               <w:pStyle w:val="Compact"/>
-              <w:jc w:val="right"/>
             </w:pPr>
             <w:r>
               <w:t xml:space="preserve">Firm count</w:t>
@@ -207,7 +265,6 @@
           <w:p>
             <w:pPr>
               <w:pStyle w:val="Compact"/>
-              <w:jc w:val="right"/>
             </w:pPr>
             <w:r>
               <w:t xml:space="preserve">115,690</w:t>
@@ -243,7 +300,6 @@
           <w:p>
             <w:pPr>
               <w:pStyle w:val="Compact"/>
-              <w:jc w:val="right"/>
             </w:pPr>
             <w:r>
               <w:t xml:space="preserve">106,577</w:t>
@@ -279,8 +335,15 @@
         <w:t xml:space="preserve">The dataset was last refreshed in April 2026 against the most recent DOL bulk filings. The refresh produced a +0.35 percent change in headline counts, with late-mandate states (Maine, Delaware, New Jersey) showing the expected catch-up as filing lag resolved. Source provenance for every filing year is documented in the project repository.</w:t>
       </w:r>
     </w:p>
+    <w:p>
+      <w:r>
+        <w:pict>
+          <v:rect style="width:0;height:1.5pt" o:hralign="center" o:hrstd="t" o:hr="t"/>
+        </w:pict>
+      </w:r>
+    </w:p>
     <w:bookmarkEnd w:id="11"/>
-    <w:bookmarkStart w:id="15" w:name="identification-strategy"/>
+    <w:bookmarkStart w:id="16" w:name="identification-strategy"/>
     <w:p>
       <w:pPr>
         <w:pStyle w:val="Heading2"/>
@@ -311,7 +374,37 @@
         <w:pStyle w:val="BodyText"/>
       </w:pPr>
       <w:r>
-        <w:t xml:space="preserve">The estimator was implemented in Python's differences package and cross-validated in R's did package. Headline ATT estimates agree to four decimal places across implementations.</w:t>
+        <w:t xml:space="preserve">The estimator was implemented in Python's</w:t>
+      </w:r>
+      <w:r>
+        <w:t xml:space="preserve"> </w:t>
+      </w:r>
+      <w:r>
+        <w:rPr>
+          <w:rStyle w:val="VerbatimChar"/>
+        </w:rPr>
+        <w:t xml:space="preserve">differences</w:t>
+      </w:r>
+      <w:r>
+        <w:t xml:space="preserve"> </w:t>
+      </w:r>
+      <w:r>
+        <w:t xml:space="preserve">package and cross-validated in R's</w:t>
+      </w:r>
+      <w:r>
+        <w:t xml:space="preserve"> </w:t>
+      </w:r>
+      <w:r>
+        <w:rPr>
+          <w:rStyle w:val="VerbatimChar"/>
+        </w:rPr>
+        <w:t xml:space="preserve">did</w:t>
+      </w:r>
+      <w:r>
+        <w:t xml:space="preserve"> </w:t>
+      </w:r>
+      <w:r>
+        <w:t xml:space="preserve">package. Headline ATT estimates agree to four decimal places across implementations.</w:t>
       </w:r>
     </w:p>
     <w:bookmarkEnd w:id="12"/>
@@ -359,8 +452,33 @@
       </w:r>
     </w:p>
     <w:bookmarkEnd w:id="14"/>
+    <w:bookmarkStart w:id="15" w:name="covariates"/>
+    <w:p>
+      <w:pPr>
+        <w:pStyle w:val="Heading3"/>
+      </w:pPr>
+      <w:r>
+        <w:t xml:space="preserve">Covariates</w:t>
+      </w:r>
+    </w:p>
+    <w:p>
+      <w:pPr>
+        <w:pStyle w:val="FirstParagraph"/>
+      </w:pPr>
+      <w:r>
+        <w:t xml:space="preserve">State and year fixed effects. No additional covariates are included in the baseline specification.</w:t>
+      </w:r>
+    </w:p>
+    <w:p>
+      <w:r>
+        <w:pict>
+          <v:rect style="width:0;height:1.5pt" o:hralign="center" o:hrstd="t" o:hr="t"/>
+        </w:pict>
+      </w:r>
+    </w:p>
     <w:bookmarkEnd w:id="15"/>
-    <w:bookmarkStart w:id="19" w:name="headline-findings"/>
+    <w:bookmarkEnd w:id="16"/>
+    <w:bookmarkStart w:id="20" w:name="headline-findings"/>
     <w:p>
       <w:pPr>
         <w:pStyle w:val="Heading2"/>
@@ -369,7 +487,7 @@
         <w:t xml:space="preserve">Headline Findings</w:t>
       </w:r>
     </w:p>
-    <w:bookmarkStart w:id="16" w:name="average-treatment-effect"/>
+    <w:bookmarkStart w:id="17" w:name="average-treatment-effect"/>
     <w:p>
       <w:pPr>
         <w:pStyle w:val="Heading3"/>
@@ -454,7 +572,6 @@
           <w:p>
             <w:pPr>
               <w:pStyle w:val="Compact"/>
-              <w:jc w:val="right"/>
             </w:pPr>
             <w:r>
               <w:t xml:space="preserve">ATT (conservative)</w:t>
@@ -466,7 +583,6 @@
           <w:p>
             <w:pPr>
               <w:pStyle w:val="Compact"/>
-              <w:jc w:val="right"/>
             </w:pPr>
             <w:r>
               <w:t xml:space="preserve">ATT (inclusive)</w:t>
@@ -482,22 +598,18 @@
               <w:pStyle w:val="Compact"/>
             </w:pPr>
             <w:r>
-              <w:rPr>
-                <w:b/>
-                <w:bCs/>
-              </w:rPr>
-              <w:t xml:space="preserve">Census CBP estabs</w:t>
-            </w:r>
-          </w:p>
-        </w:tc>
-        <w:tc>
-          <w:tcPr/>
-          <w:p>
-            <w:pPr>
-              <w:pStyle w:val="Compact"/>
-            </w:pPr>
-            <w:r>
-              <w:t xml:space="preserve">Census</w:t>
+              <w:t xml:space="preserve">Census CBP</w:t>
+            </w:r>
+          </w:p>
+        </w:tc>
+        <w:tc>
+          <w:tcPr/>
+          <w:p>
+            <w:pPr>
+              <w:pStyle w:val="Compact"/>
+            </w:pPr>
+            <w:r>
+              <w:t xml:space="preserve">Establishment count</w:t>
             </w:r>
           </w:p>
         </w:tc>
@@ -517,13 +629,8 @@
           <w:p>
             <w:pPr>
               <w:pStyle w:val="Compact"/>
-              <w:jc w:val="right"/>
-            </w:pPr>
-            <w:r>
-              <w:rPr>
-                <w:b/>
-                <w:bCs/>
-              </w:rPr>
+            </w:pPr>
+            <w:r>
               <w:t xml:space="preserve">2.37</w:t>
             </w:r>
           </w:p>
@@ -533,13 +640,8 @@
           <w:p>
             <w:pPr>
               <w:pStyle w:val="Compact"/>
-              <w:jc w:val="right"/>
-            </w:pPr>
-            <w:r>
-              <w:rPr>
-                <w:b/>
-                <w:bCs/>
-              </w:rPr>
+            </w:pPr>
+            <w:r>
               <w:t xml:space="preserve">2.37</w:t>
             </w:r>
           </w:p>
@@ -553,18 +655,7 @@
               <w:pStyle w:val="Compact"/>
             </w:pPr>
             <w:r>
-              <w:t xml:space="preserve">BLS QCEW worksites</w:t>
-            </w:r>
-          </w:p>
-        </w:tc>
-        <w:tc>
-          <w:tcPr/>
-          <w:p>
-            <w:pPr>
-              <w:pStyle w:val="Compact"/>
-            </w:pPr>
-            <w:r>
-              <w:t xml:space="preserve">BLS</w:t>
+              <w:t xml:space="preserve">BLS QCEW</w:t>
             </w:r>
           </w:p>
         </w:tc>
@@ -584,7 +675,17 @@
           <w:p>
             <w:pPr>
               <w:pStyle w:val="Compact"/>
-              <w:jc w:val="right"/>
+            </w:pPr>
+            <w:r>
+              <w:t xml:space="preserve">Employment-covered worksite</w:t>
+            </w:r>
+          </w:p>
+        </w:tc>
+        <w:tc>
+          <w:tcPr/>
+          <w:p>
+            <w:pPr>
+              <w:pStyle w:val="Compact"/>
             </w:pPr>
             <w:r>
               <w:t xml:space="preserve">1.62</w:t>
@@ -596,7 +697,6 @@
           <w:p>
             <w:pPr>
               <w:pStyle w:val="Compact"/>
-              <w:jc w:val="right"/>
             </w:pPr>
             <w:r>
               <w:t xml:space="preserve">1.59</w:t>
@@ -623,17 +723,6 @@
               <w:pStyle w:val="Compact"/>
             </w:pPr>
             <w:r>
-              <w:t xml:space="preserve">Census</w:t>
-            </w:r>
-          </w:p>
-        </w:tc>
-        <w:tc>
-          <w:tcPr/>
-          <w:p>
-            <w:pPr>
-              <w:pStyle w:val="Compact"/>
-            </w:pPr>
-            <w:r>
               <w:t xml:space="preserve">Legal entity</w:t>
             </w:r>
           </w:p>
@@ -643,7 +732,17 @@
           <w:p>
             <w:pPr>
               <w:pStyle w:val="Compact"/>
-              <w:jc w:val="right"/>
+            </w:pPr>
+            <w:r>
+              <w:t xml:space="preserve">Firm</w:t>
+            </w:r>
+          </w:p>
+        </w:tc>
+        <w:tc>
+          <w:tcPr/>
+          <w:p>
+            <w:pPr>
+              <w:pStyle w:val="Compact"/>
             </w:pPr>
             <w:r>
               <w:t xml:space="preserve">2.90</w:t>
@@ -655,7 +754,6 @@
           <w:p>
             <w:pPr>
               <w:pStyle w:val="Compact"/>
-              <w:jc w:val="right"/>
             </w:pPr>
             <w:r>
               <w:t xml:space="preserve">2.89</w:t>
@@ -671,22 +769,18 @@
               <w:pStyle w:val="Compact"/>
             </w:pPr>
             <w:r>
-              <w:rPr>
-                <w:b/>
-                <w:bCs/>
-              </w:rPr>
-              <w:t xml:space="preserve">Census SUSB (5+ emp)</w:t>
-            </w:r>
-          </w:p>
-        </w:tc>
-        <w:tc>
-          <w:tcPr/>
-          <w:p>
-            <w:pPr>
-              <w:pStyle w:val="Compact"/>
-            </w:pPr>
-            <w:r>
-              <w:t xml:space="preserve">Census</w:t>
+              <w:t xml:space="preserve">Census SUSB (5+ employees)</w:t>
+            </w:r>
+          </w:p>
+        </w:tc>
+        <w:tc>
+          <w:tcPr/>
+          <w:p>
+            <w:pPr>
+              <w:pStyle w:val="Compact"/>
+            </w:pPr>
+            <w:r>
+              <w:t xml:space="preserve">Legal entity, mandate-eligible</w:t>
             </w:r>
           </w:p>
         </w:tc>
@@ -706,13 +800,8 @@
           <w:p>
             <w:pPr>
               <w:pStyle w:val="Compact"/>
-              <w:jc w:val="right"/>
-            </w:pPr>
-            <w:r>
-              <w:rPr>
-                <w:b/>
-                <w:bCs/>
-              </w:rPr>
+            </w:pPr>
+            <w:r>
               <w:t xml:space="preserve">7.83</w:t>
             </w:r>
           </w:p>
@@ -722,13 +811,8 @@
           <w:p>
             <w:pPr>
               <w:pStyle w:val="Compact"/>
-              <w:jc w:val="right"/>
-            </w:pPr>
-            <w:r>
-              <w:rPr>
-                <w:b/>
-                <w:bCs/>
-              </w:rPr>
+            </w:pPr>
+            <w:r>
               <w:t xml:space="preserve">7.83</w:t>
             </w:r>
           </w:p>
@@ -743,8 +827,8 @@
         <w:t xml:space="preserve">The variation across denominators reflects differences in what is being counted (physical locations vs. legal entities vs. employment-covered worksites), not differences in the underlying causal effect. The qualitative conclusion — that mandates cause meaningful new 401(k) plan formation — holds under all four specifications. The SUSB-5+ specification, normalizing by mandate-eligible firms, gives the most policy-relevant magnitude: roughly eight additional 401(k) plans per 1,000 firms in the directly affected population, per year.</w:t>
       </w:r>
     </w:p>
-    <w:bookmarkEnd w:id="16"/>
-    <w:bookmarkStart w:id="17" w:name="robustness"/>
+    <w:bookmarkEnd w:id="17"/>
+    <w:bookmarkStart w:id="18" w:name="robustness"/>
     <w:p>
       <w:pPr>
         <w:pStyle w:val="Heading3"/>
@@ -791,7 +875,6 @@
           <w:p>
             <w:pPr>
               <w:pStyle w:val="Compact"/>
-              <w:jc w:val="right"/>
             </w:pPr>
             <w:r>
               <w:t xml:space="preserve">ATT</w:t>
@@ -807,10 +890,6 @@
               <w:pStyle w:val="Compact"/>
             </w:pPr>
             <w:r>
-              <w:rPr>
-                <w:b/>
-                <w:bCs/>
-              </w:rPr>
               <w:t xml:space="preserve">Headline (CBP, conservative, cohort-weighted simple)</w:t>
             </w:r>
           </w:p>
@@ -820,13 +899,8 @@
           <w:p>
             <w:pPr>
               <w:pStyle w:val="Compact"/>
-              <w:jc w:val="right"/>
-            </w:pPr>
-            <w:r>
-              <w:rPr>
-                <w:b/>
-                <w:bCs/>
-              </w:rPr>
+            </w:pPr>
+            <w:r>
               <w:t xml:space="preserve">2.37</w:t>
             </w:r>
           </w:p>
@@ -849,7 +923,6 @@
           <w:p>
             <w:pPr>
               <w:pStyle w:val="Compact"/>
-              <w:jc w:val="right"/>
             </w:pPr>
             <w:r>
               <w:t xml:space="preserve">2.12</w:t>
@@ -874,7 +947,6 @@
           <w:p>
             <w:pPr>
               <w:pStyle w:val="Compact"/>
-              <w:jc w:val="right"/>
             </w:pPr>
             <w:r>
               <w:t xml:space="preserve">2.31</w:t>
@@ -899,7 +971,6 @@
           <w:p>
             <w:pPr>
               <w:pStyle w:val="Compact"/>
-              <w:jc w:val="right"/>
             </w:pPr>
             <w:r>
               <w:t xml:space="preserve">1.82</w:t>
@@ -924,7 +995,6 @@
           <w:p>
             <w:pPr>
               <w:pStyle w:val="Compact"/>
-              <w:jc w:val="right"/>
             </w:pPr>
             <w:r>
               <w:t xml:space="preserve">2.19</w:t>
@@ -941,8 +1011,8 @@
         <w:t xml:space="preserve">Dropping California — which accounts for the largest single share of the dataset — reduces the ATT only modestly, from 2.37 to 2.12. The estimate is not driven by any one state.</w:t>
       </w:r>
     </w:p>
-    <w:bookmarkEnd w:id="17"/>
-    <w:bookmarkStart w:id="18" w:name="pre-trends-and-sensitivity"/>
+    <w:bookmarkEnd w:id="18"/>
+    <w:bookmarkStart w:id="19" w:name="pre-trends-and-sensitivity"/>
     <w:p>
       <w:pPr>
         <w:pStyle w:val="Heading3"/>
@@ -967,9 +1037,16 @@
         <w:t xml:space="preserve">A permutation test that randomly reassigns treatment dates to control states places the observed ATT outside the entire placebo distribution (p ≈ 0.00).</w:t>
       </w:r>
     </w:p>
-    <w:bookmarkEnd w:id="18"/>
+    <w:p>
+      <w:r>
+        <w:pict>
+          <v:rect style="width:0;height:1.5pt" o:hralign="center" o:hrstd="t" o:hr="t"/>
+        </w:pict>
+      </w:r>
+    </w:p>
     <w:bookmarkEnd w:id="19"/>
-    <w:bookmarkStart w:id="20" w:name="external-corroboration"/>
+    <w:bookmarkEnd w:id="20"/>
+    <w:bookmarkStart w:id="21" w:name="external-corroboration"/>
     <w:p>
       <w:pPr>
         <w:pStyle w:val="Heading2"/>
@@ -1010,8 +1087,15 @@
         <w:t xml:space="preserve">The Colorado Department of Treasury officially cites the Gusto analysis in its December 2024 program announcement, with State Treasurer Dave Young noting the +45 percent figure when urging continued employer compliance. Independent corroboration of this kind — covering provider data, official state communications, and our own federal-data analysis — supports the conclusion that the mandate-to-401(k) mechanism is real, measurable, and concentrated in the small-employer population.</w:t>
       </w:r>
     </w:p>
-    <w:bookmarkEnd w:id="20"/>
-    <w:bookmarkStart w:id="21" w:name="firm-level-findings"/>
+    <w:p>
+      <w:r>
+        <w:pict>
+          <v:rect style="width:0;height:1.5pt" o:hralign="center" o:hrstd="t" o:hr="t"/>
+        </w:pict>
+      </w:r>
+    </w:p>
+    <w:bookmarkEnd w:id="21"/>
+    <w:bookmarkStart w:id="22" w:name="firm-level-findings"/>
     <w:p>
       <w:pPr>
         <w:pStyle w:val="Heading2"/>
@@ -1025,7 +1109,83 @@
         <w:pStyle w:val="FirstParagraph"/>
       </w:pPr>
       <w:r>
-        <w:t xml:space="preserve">The mandate-induced 401(k) population skews heavily toward small employers. In the v2-conservative dataset of 106,577 firms, 62 percent of plans are established by firms with 0–9 participants and 0.7 percent are established by firms with 250 or more participants. Median plan size is in the micro-firm range.</w:t>
+        <w:t xml:space="preserve">The mandate-induced 401(k) population skews heavily toward small employers. In the v2-conservative dataset of 106,577 firms:</w:t>
+      </w:r>
+    </w:p>
+    <w:p>
+      <w:pPr>
+        <w:pStyle w:val="Compact"/>
+        <w:numPr>
+          <w:ilvl w:val="0"/>
+          <w:numId w:val="1001"/>
+        </w:numPr>
+      </w:pPr>
+      <w:r>
+        <w:t xml:space="preserve">62 percent of plans are established by firms with 0–9 participants</w:t>
+      </w:r>
+    </w:p>
+    <w:p>
+      <w:pPr>
+        <w:pStyle w:val="Compact"/>
+        <w:numPr>
+          <w:ilvl w:val="0"/>
+          <w:numId w:val="1001"/>
+        </w:numPr>
+      </w:pPr>
+      <w:r>
+        <w:t xml:space="preserve">0.7 percent are established by firms with 250 or more participants</w:t>
+      </w:r>
+    </w:p>
+    <w:p>
+      <w:pPr>
+        <w:pStyle w:val="Compact"/>
+        <w:numPr>
+          <w:ilvl w:val="0"/>
+          <w:numId w:val="1001"/>
+        </w:numPr>
+      </w:pPr>
+      <w:r>
+        <w:t xml:space="preserve">Median plan size is in the micro-firm range</w:t>
+      </w:r>
+    </w:p>
+    <w:p>
+      <w:pPr>
+        <w:pStyle w:val="FirstParagraph"/>
+      </w:pPr>
+      <w:r>
+        <w:t xml:space="preserve">Normalizing against the SUSB firm-size distribution sharpens this picture. Per-firm response rates rise monotonically with firm size up to the 20–99 employee band before declining, but the absolute count of mandate-induced plans is dominated by the smallest firm-size bands simply because those bands contain the most firms. The substantive interpretation: the mandate produces a higher</w:t>
+      </w:r>
+      <w:r>
+        <w:t xml:space="preserve"> </w:t>
+      </w:r>
+      <w:r>
+        <w:rPr>
+          <w:i/>
+          <w:iCs/>
+        </w:rPr>
+        <w:t xml:space="preserve">response rate</w:t>
+      </w:r>
+      <w:r>
+        <w:t xml:space="preserve"> </w:t>
+      </w:r>
+      <w:r>
+        <w:t xml:space="preserve">per firm in the 20–99 size band, but the largest</w:t>
+      </w:r>
+      <w:r>
+        <w:t xml:space="preserve"> </w:t>
+      </w:r>
+      <w:r>
+        <w:rPr>
+          <w:i/>
+          <w:iCs/>
+        </w:rPr>
+        <w:t xml:space="preserve">absolute number</w:t>
+      </w:r>
+      <w:r>
+        <w:t xml:space="preserve"> </w:t>
+      </w:r>
+      <w:r>
+        <w:t xml:space="preserve">of new plans comes from the 5–9 size band.</w:t>
       </w:r>
     </w:p>
     <w:p>
@@ -1033,7 +1193,7 @@
         <w:pStyle w:val="BodyText"/>
       </w:pPr>
       <w:r>
-        <w:t xml:space="preserve">Normalizing against the SUSB firm-size distribution sharpens this picture. Per-firm response rates rise monotonically with firm size up to the 20–99 employee band before declining, but the absolute count of mandate-induced plans is dominated by the smallest firm-size bands simply because those bands contain the most firms. The substantive interpretation: the mandate produces a higher response rate per firm in the 20–99 size band, but the largest absolute number of new plans comes from the 5–9 size band.</w:t>
+        <w:t xml:space="preserve">This finding is consistent with the qualitative evidence collected from independent sources. Gusto's Colorado analysis identifies the 5–9 employee band as the largest source of mandate-induced 401(k) adoption. Provider commentary from Guideline, Human Interest, ForUsAll, and Vestwell consistently identifies small-firm mandate-deadline pressure as the proximate driver of new 401(k) plan formation. A 20-employee Bend, Oregon construction firm cited by Deschutes Investment Consulting and a Denver restaurant featured in the Colorado Treasurer's press release provide named firm-level examples of the choice between the state program and a private 401(k).</w:t>
       </w:r>
     </w:p>
     <w:p>
@@ -1041,19 +1201,18 @@
         <w:pStyle w:val="BodyText"/>
       </w:pPr>
       <w:r>
-        <w:t xml:space="preserve">This finding is consistent with the qualitative evidence collected from independent sources. Gusto's Colorado analysis identifies the 5–9 employee band as the largest source of mandate-induced 401(k) adoption. Provider commentary from Guideline, Human Interest, ForUsAll, and Vestwell consistently identifies small-firm mandate-deadline pressure as the proximate driver of new 401(k) plan formation. A 20-employee Bend, Oregon construction firm cited by Deschutes Investment Consulting and a Denver restaurant featured in the Colorado Treasurer's press release provide named firm-level examples of the choice between the state program and a private 401(k).</w:t>
-      </w:r>
-    </w:p>
-    <w:p>
-      <w:pPr>
-        <w:pStyle w:val="BodyText"/>
-      </w:pPr>
-      <w:r>
         <w:t xml:space="preserve">The substantive policy implication: the population that responds to state auto-IRA mandates by establishing private 401(k) plans is largely the small-employer population that the mandates are nominally designed to bring into the retirement system in the first place. Mandates appear to function as a forcing event that converts firms-without-plans into firms-with-private-plans, with the state program serving as the alternative for firms that prefer not to administer their own.</w:t>
       </w:r>
     </w:p>
-    <w:bookmarkEnd w:id="21"/>
-    <w:bookmarkStart w:id="22" w:name="limitations-and-open-questions"/>
+    <w:p>
+      <w:r>
+        <w:pict>
+          <v:rect style="width:0;height:1.5pt" o:hralign="center" o:hrstd="t" o:hr="t"/>
+        </w:pict>
+      </w:r>
+    </w:p>
+    <w:bookmarkEnd w:id="22"/>
+    <w:bookmarkStart w:id="23" w:name="limitations-and-open-questions"/>
     <w:p>
       <w:pPr>
         <w:pStyle w:val="Heading2"/>
@@ -1142,8 +1301,15 @@
         <w:t xml:space="preserve">State auto-IRA program exemption-filing counts substantially exceed our v3 firm counts in most states, but this reflects a definitional difference rather than a measurement discrepancy. State exemption counts include all employers offering any qualifying plan (including pre-mandate plans, 403(b)s, SEPs, defined benefit plans, and SIMPLE IRAs), while our dataset captures only firms whose first qualifying Form 5500 post-mandate is a new 401(k). The ratio between the two — ranging from approximately 1.4x in Maryland to roughly 9x in Colorado — itself reveals useful information about the size of the pre-existing private retirement plan stock by state, but it does not constitute direct firm-level validation. A targeted records request to the CalSavers program for firm-level exemption data was scoped but not pursued.</w:t>
       </w:r>
     </w:p>
-    <w:bookmarkEnd w:id="22"/>
-    <w:bookmarkStart w:id="23" w:name="conclusion"/>
+    <w:p>
+      <w:r>
+        <w:pict>
+          <v:rect style="width:0;height:1.5pt" o:hralign="center" o:hrstd="t" o:hr="t"/>
+        </w:pict>
+      </w:r>
+    </w:p>
+    <w:bookmarkEnd w:id="23"/>
+    <w:bookmarkStart w:id="24" w:name="conclusion"/>
     <w:p>
       <w:pPr>
         <w:pStyle w:val="Heading2"/>
@@ -1176,8 +1342,15 @@
         <w:t xml:space="preserve">The dataset, methodology, and analysis files are maintained in a public repository to support replication and extension.</w:t>
       </w:r>
     </w:p>
-    <w:bookmarkEnd w:id="23"/>
-    <w:bookmarkStart w:id="24" w:name="methodology-notes"/>
+    <w:p>
+      <w:r>
+        <w:pict>
+          <v:rect style="width:0;height:1.5pt" o:hralign="center" o:hrstd="t" o:hr="t"/>
+        </w:pict>
+      </w:r>
+    </w:p>
+    <w:bookmarkEnd w:id="24"/>
+    <w:bookmarkStart w:id="25" w:name="methodology-notes"/>
     <w:p>
       <w:pPr>
         <w:pStyle w:val="Heading2"/>
@@ -1303,8 +1476,8 @@
         <w:t xml:space="preserve">Long-horizon event-time aggregations are sensitive to plausible parallel-trends violations under Rambachan-Roth sensitivity analysis. This sensitivity is concentrated in noisy long-horizon coefficients identified by one or two cohorts (e.g., t=3 in v2-conservative, t=4 in v1-inclusive). The cohort-weighted simple aggregation, used as the headline, does not over-weight these noisy estimates and has substantially tighter sensitivity bounds.</w:t>
       </w:r>
     </w:p>
-    <w:bookmarkEnd w:id="24"/>
     <w:bookmarkEnd w:id="25"/>
+    <w:bookmarkEnd w:id="26"/>
     <w:sectPr>
       <w:footnotePr>
         <w:numRestart w:val="eachSect"/>
@@ -1415,8 +1588,114 @@
       </w:pPr>
     </w:lvl>
   </w:abstractNum>
+  <w:abstractNum w:abstractNumId="991">
+    <w:nsid w:val="0000A991"/>
+    <w:multiLevelType w:val="multilevel"/>
+    <w:lvl w:ilvl="0">
+      <w:numFmt w:val="bullet"/>
+      <w:lvlText w:val=""/>
+      <w:lvlJc w:val="left"/>
+      <w:pPr>
+        <w:ind w:left="720" w:hanging="360"/>
+      </w:pPr>
+      <w:rPr>
+        <w:rFonts w:ascii="Symbol" w:hAnsi="Symbol" w:cs="Symbol" w:hint="default"/>
+      </w:rPr>
+    </w:lvl>
+    <w:lvl w:ilvl="1">
+      <w:numFmt w:val="bullet"/>
+      <w:lvlText w:val="o"/>
+      <w:lvlJc w:val="left"/>
+      <w:pPr>
+        <w:ind w:left="1440" w:hanging="360"/>
+      </w:pPr>
+      <w:rPr>
+        <w:rFonts w:ascii="Courier New" w:hAnsi="Courier New" w:cs="Courier New" w:hint="default"/>
+      </w:rPr>
+    </w:lvl>
+    <w:lvl w:ilvl="2">
+      <w:numFmt w:val="bullet"/>
+      <w:lvlText w:val=""/>
+      <w:lvlJc w:val="left"/>
+      <w:pPr>
+        <w:ind w:left="2160" w:hanging="360"/>
+      </w:pPr>
+      <w:rPr>
+        <w:rFonts w:ascii="Wingdings" w:hAnsi="Wingdings" w:cs="Wingdings" w:hint="default"/>
+      </w:rPr>
+    </w:lvl>
+    <w:lvl w:ilvl="3">
+      <w:numFmt w:val="bullet"/>
+      <w:lvlText w:val=""/>
+      <w:lvlJc w:val="left"/>
+      <w:pPr>
+        <w:ind w:left="2880" w:hanging="360"/>
+      </w:pPr>
+      <w:rPr>
+        <w:rFonts w:ascii="Symbol" w:hAnsi="Symbol" w:cs="Symbol" w:hint="default"/>
+      </w:rPr>
+    </w:lvl>
+    <w:lvl w:ilvl="4">
+      <w:numFmt w:val="bullet"/>
+      <w:lvlText w:val="o"/>
+      <w:lvlJc w:val="left"/>
+      <w:pPr>
+        <w:ind w:left="3600" w:hanging="360"/>
+      </w:pPr>
+      <w:rPr>
+        <w:rFonts w:ascii="Courier New" w:hAnsi="Courier New" w:cs="Courier New" w:hint="default"/>
+      </w:rPr>
+    </w:lvl>
+    <w:lvl w:ilvl="5">
+      <w:numFmt w:val="bullet"/>
+      <w:lvlText w:val=""/>
+      <w:lvlJc w:val="left"/>
+      <w:pPr>
+        <w:ind w:left="4320" w:hanging="360"/>
+      </w:pPr>
+      <w:rPr>
+        <w:rFonts w:ascii="Wingdings" w:hAnsi="Wingdings" w:cs="Wingdings" w:hint="default"/>
+      </w:rPr>
+    </w:lvl>
+    <w:lvl w:ilvl="6">
+      <w:numFmt w:val="bullet"/>
+      <w:lvlText w:val=""/>
+      <w:lvlJc w:val="left"/>
+      <w:pPr>
+        <w:ind w:left="5040" w:hanging="360"/>
+      </w:pPr>
+      <w:rPr>
+        <w:rFonts w:ascii="Symbol" w:hAnsi="Symbol" w:cs="Symbol" w:hint="default"/>
+      </w:rPr>
+    </w:lvl>
+    <w:lvl w:ilvl="7">
+      <w:numFmt w:val="bullet"/>
+      <w:lvlText w:val="o"/>
+      <w:lvlJc w:val="left"/>
+      <w:pPr>
+        <w:ind w:left="5760" w:hanging="360"/>
+      </w:pPr>
+      <w:rPr>
+        <w:rFonts w:ascii="Courier New" w:hAnsi="Courier New" w:cs="Courier New" w:hint="default"/>
+      </w:rPr>
+    </w:lvl>
+    <w:lvl w:ilvl="8">
+      <w:numFmt w:val="bullet"/>
+      <w:lvlText w:val=""/>
+      <w:lvlJc w:val="left"/>
+      <w:pPr>
+        <w:ind w:left="6480" w:hanging="360"/>
+      </w:pPr>
+      <w:rPr>
+        <w:rFonts w:ascii="Wingdings" w:hAnsi="Wingdings" w:cs="Wingdings" w:hint="default"/>
+      </w:rPr>
+    </w:lvl>
+  </w:abstractNum>
   <w:num w:numId="1000">
     <w:abstractNumId w:val="990"/>
+  </w:num>
+  <w:num w:numId="1001">
+    <w:abstractNumId w:val="991"/>
   </w:num>
 </w:numbering>
 </file>

</xml_diff>